<commit_message>
fix(deck): plain-language reorder timing in per-AM docs (drop p50/p90 jargon)
Reps don't read 'p50 gap 162d / vs p90 gap 410d'. Translate the timing line in the doc generator
only (deck JSON left as-is): p50 -> 'they typically reorder about every N days'; p90 dropped; keep
the plain status words (in cadence / due soon / overdue / dormant). Rebuilt from the structured
timing evidence, not string-rewritten.

Regenerated Nic + Linda: 0 p50/p90 strings remain; revenue, pitch, Pattern and fit lines unchanged.

Co-Authored-By: Claude Opus 4.8 (1M context) <noreply@anthropic.com>
</commit_message>
<xml_diff>
--- a/docs/data-insights/outreach_linda.docx
+++ b/docs/data-insights/outreach_linda.docx
@@ -242,7 +242,7 @@
           <w:b w:val="0"/>
           <w:i w:val="0"/>
         </w:rPr>
-        <w:t>overdue - 258d since last order vs p90 gap 74d; approaching Jul seasonal peak</w:t>
+        <w:t>Overdue: last ordered 258 days ago; they typically reorder about every 16 days, so they're past due. They also tend to pick up around Jul, which is coming up.</w:t>
       </w:r>
     </w:p>
     <w:p>
@@ -388,7 +388,7 @@
           <w:b w:val="0"/>
           <w:i w:val="0"/>
         </w:rPr>
-        <w:t>due soon - 43d since last order vs p50 gap 10d</w:t>
+        <w:t>Due soon: last ordered 43 days ago; they typically reorder about every 10 days, so they're about due.</w:t>
       </w:r>
     </w:p>
     <w:p>
@@ -553,7 +553,7 @@
           <w:b w:val="0"/>
           <w:i w:val="0"/>
         </w:rPr>
-        <w:t>due soon - 286d since last order vs p50 gap 219d</w:t>
+        <w:t>Due soon: last ordered 286 days ago; they typically reorder about every 219 days, so they're about due.</w:t>
       </w:r>
     </w:p>
     <w:p>
@@ -719,7 +719,7 @@
           <w:b w:val="0"/>
           <w:i w:val="0"/>
         </w:rPr>
-        <w:t>in cadence - 13d since last order, under p50 gap 16d; no strong reorder signal</w:t>
+        <w:t>In cadence: last ordered 13 days ago; they typically reorder about every 16 days, so they're not due yet.</w:t>
       </w:r>
     </w:p>
     <w:p>
@@ -864,7 +864,7 @@
           <w:b w:val="0"/>
           <w:i w:val="0"/>
         </w:rPr>
-        <w:t>due soon - 328d since last order vs p50 gap 69d</w:t>
+        <w:t>Due soon: last ordered 328 days ago; they typically reorder about every 69 days, so they're about due.</w:t>
       </w:r>
     </w:p>
     <w:p>
@@ -1030,7 +1030,7 @@
           <w:b w:val="0"/>
           <w:i w:val="0"/>
         </w:rPr>
-        <w:t>due soon - 317d since last order vs p50 gap 210d</w:t>
+        <w:t>Due soon: last ordered 317 days ago; they typically reorder about every 210 days, so they're about due.</w:t>
       </w:r>
     </w:p>
     <w:p>
@@ -1176,7 +1176,7 @@
           <w:b w:val="0"/>
           <w:i w:val="0"/>
         </w:rPr>
-        <w:t>in cadence - 14d since last order, under p50 gap 27d; no strong reorder signal</w:t>
+        <w:t>In cadence: last ordered 14 days ago; they typically reorder about every 27 days, so they're not due yet.</w:t>
       </w:r>
     </w:p>
     <w:p>
@@ -1322,7 +1322,7 @@
           <w:b w:val="0"/>
           <w:i w:val="0"/>
         </w:rPr>
-        <w:t>overdue - 72d since last order vs p90 gap 40d</w:t>
+        <w:t>Overdue: last ordered 72 days ago; they typically reorder about every 40 days, so they're past due.</w:t>
       </w:r>
     </w:p>
     <w:p>
@@ -1467,7 +1467,7 @@
           <w:b w:val="0"/>
           <w:i w:val="0"/>
         </w:rPr>
-        <w:t>due soon - 72d since last order vs p50 gap 42d</w:t>
+        <w:t>Due soon: last ordered 72 days ago; they typically reorder about every 42 days, so they're about due.</w:t>
       </w:r>
     </w:p>
     <w:p>
@@ -1612,7 +1612,7 @@
           <w:b w:val="0"/>
           <w:i w:val="0"/>
         </w:rPr>
-        <w:t>overdue - 70d since last order vs p90 gap 39d</w:t>
+        <w:t>Overdue: last ordered 70 days ago; they typically reorder about every 22 days, so they're past due.</w:t>
       </w:r>
     </w:p>
     <w:p>
@@ -1778,7 +1778,7 @@
           <w:b w:val="0"/>
           <w:i w:val="0"/>
         </w:rPr>
-        <w:t>due soon - 226d since last order vs p50 gap 184d</w:t>
+        <w:t>Due soon: last ordered 226 days ago; they typically reorder about every 184 days, so they're about due.</w:t>
       </w:r>
     </w:p>
     <w:p>
@@ -1924,7 +1924,7 @@
           <w:b w:val="0"/>
           <w:i w:val="0"/>
         </w:rPr>
-        <w:t>in cadence - 235d since last order, under p50 gap 734d; no strong reorder signal</w:t>
+        <w:t>In cadence: last ordered 235 days ago; they typically reorder about every 734 days, so they're not due yet.</w:t>
       </w:r>
     </w:p>
     <w:p>
@@ -2069,7 +2069,7 @@
           <w:b w:val="0"/>
           <w:i w:val="0"/>
         </w:rPr>
-        <w:t>overdue - 205d since last order vs p90 gap 31d</w:t>
+        <w:t>Overdue: last ordered 205 days ago; they typically reorder about every 31 days, so they're past due.</w:t>
       </w:r>
     </w:p>
     <w:p>
@@ -2235,7 +2235,7 @@
           <w:b w:val="0"/>
           <w:i w:val="0"/>
         </w:rPr>
-        <w:t>in cadence - 181d since last order, under p50 gap 251d; no strong reorder signal</w:t>
+        <w:t>In cadence: last ordered 181 days ago; they typically reorder about every 251 days, so they're not due yet.</w:t>
       </w:r>
     </w:p>
     <w:p>

</xml_diff>

<commit_message>
fix(deck): occasion-based reorder cadence in per-AM docs (drop the 'every 4 days' artifact)
The deck measures gaps between individual order DATES, so customers who place several jobs in the
same fortnight showed a tiny median ('typically reorder about every 4 days') that misreads as a
reorder rhythm. The generator now collapses orders within 14 days into one ordering OCCASION (a
project) and takes the median/p90 gap between occasions, and re-derives the in-cadence/due-soon/
overdue status from that. Presentation-only (deck ranking/JSON unchanged).

Regenerated Nic + Linda: reorder gaps now 15-751d (Nic) / 31-734d (Linda), none under 14d; e.g.
Coco Republic 'every 4 days, overdue' -> 'every 46 days, about due'. Opening note, 12mo revenue,
Pattern and fit lines unchanged.

Co-Authored-By: Claude Opus 4.8 (1M context) <noreply@anthropic.com>
</commit_message>
<xml_diff>
--- a/docs/data-insights/outreach_linda.docx
+++ b/docs/data-insights/outreach_linda.docx
@@ -242,7 +242,7 @@
           <w:b w:val="0"/>
           <w:i w:val="0"/>
         </w:rPr>
-        <w:t>Overdue: last ordered 258 days ago; they typically reorder about every 16 days, so they're past due. They also tend to pick up around Jul, which is coming up.</w:t>
+        <w:t>Overdue: last ordered 258 days ago; they typically reorder about every 41 days, so they're past due. They also tend to pick up around Jul, which is coming up.</w:t>
       </w:r>
     </w:p>
     <w:p>
@@ -388,7 +388,7 @@
           <w:b w:val="0"/>
           <w:i w:val="0"/>
         </w:rPr>
-        <w:t>Due soon: last ordered 43 days ago; they typically reorder about every 10 days, so they're about due.</w:t>
+        <w:t>In cadence: last ordered 43 days ago; they typically reorder about every 45 days, so they're not due yet.</w:t>
       </w:r>
     </w:p>
     <w:p>
@@ -719,7 +719,7 @@
           <w:b w:val="0"/>
           <w:i w:val="0"/>
         </w:rPr>
-        <w:t>In cadence: last ordered 13 days ago; they typically reorder about every 16 days, so they're not due yet.</w:t>
+        <w:t>In cadence: last ordered 13 days ago; they typically reorder about every 42 days, so they're not due yet.</w:t>
       </w:r>
     </w:p>
     <w:p>
@@ -864,7 +864,7 @@
           <w:b w:val="0"/>
           <w:i w:val="0"/>
         </w:rPr>
-        <w:t>Due soon: last ordered 328 days ago; they typically reorder about every 69 days, so they're about due.</w:t>
+        <w:t>Due soon: last ordered 328 days ago; they typically reorder about every 214 days, so they're about due.</w:t>
       </w:r>
     </w:p>
     <w:p>
@@ -1030,7 +1030,7 @@
           <w:b w:val="0"/>
           <w:i w:val="0"/>
         </w:rPr>
-        <w:t>Due soon: last ordered 317 days ago; they typically reorder about every 210 days, so they're about due.</w:t>
+        <w:t>In cadence: last ordered 317 days ago; they typically reorder about every 421 days, so they're not due yet.</w:t>
       </w:r>
     </w:p>
     <w:p>
@@ -1176,7 +1176,7 @@
           <w:b w:val="0"/>
           <w:i w:val="0"/>
         </w:rPr>
-        <w:t>In cadence: last ordered 14 days ago; they typically reorder about every 27 days, so they're not due yet.</w:t>
+        <w:t>In cadence: last ordered 14 days ago; they typically reorder about every 48 days, so they're not due yet.</w:t>
       </w:r>
     </w:p>
     <w:p>
@@ -1467,7 +1467,7 @@
           <w:b w:val="0"/>
           <w:i w:val="0"/>
         </w:rPr>
-        <w:t>Due soon: last ordered 72 days ago; they typically reorder about every 42 days, so they're about due.</w:t>
+        <w:t>Due soon: last ordered 72 days ago; they typically reorder about every 56 days, so they're about due.</w:t>
       </w:r>
     </w:p>
     <w:p>
@@ -1612,7 +1612,7 @@
           <w:b w:val="0"/>
           <w:i w:val="0"/>
         </w:rPr>
-        <w:t>Overdue: last ordered 70 days ago; they typically reorder about every 22 days, so they're past due.</w:t>
+        <w:t>Overdue: last ordered 70 days ago; they typically reorder about every 45 days, so they're past due.</w:t>
       </w:r>
     </w:p>
     <w:p>
@@ -1778,7 +1778,7 @@
           <w:b w:val="0"/>
           <w:i w:val="0"/>
         </w:rPr>
-        <w:t>Due soon: last ordered 226 days ago; they typically reorder about every 184 days, so they're about due.</w:t>
+        <w:t>In cadence: last ordered 226 days ago; they typically reorder about every 420 days, so they're not due yet.</w:t>
       </w:r>
     </w:p>
     <w:p>

</xml_diff>